<commit_message>
Edits of Final Report docx and added a README.md for the grader
</commit_message>
<xml_diff>
--- a/Final_Report_Module12.docx
+++ b/Final_Report_Module12.docx
@@ -8,7 +8,13 @@
       </w:pPr>
       <w:bookmarkStart w:id="0" w:name="module-12-final-report"/>
       <w:r>
-        <w:t>Module 12 Final Report</w:t>
+        <w:t xml:space="preserve">Module 12 </w:t>
+      </w:r>
+      <w:r>
+        <w:t>Homework</w:t>
+      </w:r>
+      <w:r>
+        <w:t xml:space="preserve"> Report</w:t>
       </w:r>
     </w:p>
     <w:p>
@@ -35,6 +41,124 @@
       <w:r>
         <w:t>What I liked about this module is that the problems connected in a very natural way. Problem 2.1 produced the noise estimates and timeslot energies, Problems 2.2 through 2.4 turned those into detection and occupancy results, Problems 2.5 and 2.6 turned the occupancy sequence into a Markov model and long-term prediction, and the extra-credit problems showed how those same results can be used to think about channel access opportunities and classifier robustness.</w:t>
       </w:r>
+    </w:p>
+    <w:p>
+      <w:pPr>
+        <w:pStyle w:val="BodyText"/>
+      </w:pPr>
+      <w:r>
+        <w:t>The conceptual chain and homework workflow:</w:t>
+      </w:r>
+    </w:p>
+    <w:p>
+      <w:pPr>
+        <w:pStyle w:val="BodyText"/>
+        <w:spacing w:after="0"/>
+      </w:pPr>
+      <w:r>
+        <w:t>Noise estimation</w:t>
+      </w:r>
+    </w:p>
+    <w:p>
+      <w:pPr>
+        <w:pStyle w:val="BodyText"/>
+        <w:numPr>
+          <w:ilvl w:val="0"/>
+          <w:numId w:val="14"/>
+        </w:numPr>
+        <w:spacing w:before="0" w:after="0"/>
+      </w:pPr>
+      <w:r>
+        <w:t>threshold design</w:t>
+      </w:r>
+    </w:p>
+    <w:p>
+      <w:pPr>
+        <w:pStyle w:val="BodyText"/>
+        <w:numPr>
+          <w:ilvl w:val="0"/>
+          <w:numId w:val="14"/>
+        </w:numPr>
+        <w:spacing w:before="0" w:after="0"/>
+      </w:pPr>
+      <w:r>
+        <w:t>detection</w:t>
+      </w:r>
+    </w:p>
+    <w:p>
+      <w:pPr>
+        <w:pStyle w:val="BodyText"/>
+        <w:numPr>
+          <w:ilvl w:val="0"/>
+          <w:numId w:val="14"/>
+        </w:numPr>
+        <w:spacing w:before="0" w:after="0"/>
+      </w:pPr>
+      <w:r>
+        <w:t>occupancy sequence</w:t>
+      </w:r>
+    </w:p>
+    <w:p>
+      <w:pPr>
+        <w:pStyle w:val="BodyText"/>
+        <w:numPr>
+          <w:ilvl w:val="0"/>
+          <w:numId w:val="14"/>
+        </w:numPr>
+        <w:spacing w:before="0" w:after="0"/>
+      </w:pPr>
+      <w:r>
+        <w:t>HMM estimation</w:t>
+      </w:r>
+    </w:p>
+    <w:p>
+      <w:pPr>
+        <w:pStyle w:val="BodyText"/>
+        <w:numPr>
+          <w:ilvl w:val="0"/>
+          <w:numId w:val="14"/>
+        </w:numPr>
+        <w:spacing w:before="0" w:after="0"/>
+      </w:pPr>
+      <w:r>
+        <w:t>steady-state prediction</w:t>
+      </w:r>
+    </w:p>
+    <w:p>
+      <w:pPr>
+        <w:pStyle w:val="BodyText"/>
+        <w:numPr>
+          <w:ilvl w:val="0"/>
+          <w:numId w:val="14"/>
+        </w:numPr>
+        <w:spacing w:before="0" w:after="0"/>
+      </w:pPr>
+      <w:r>
+        <w:t>Whitespace</w:t>
+      </w:r>
+      <w:r>
+        <w:t xml:space="preserve"> opportunities</w:t>
+      </w:r>
+    </w:p>
+    <w:p>
+      <w:pPr>
+        <w:pStyle w:val="BodyText"/>
+        <w:numPr>
+          <w:ilvl w:val="0"/>
+          <w:numId w:val="14"/>
+        </w:numPr>
+        <w:spacing w:before="0" w:after="0"/>
+      </w:pPr>
+      <w:r>
+        <w:t>modulation classification robustness</w:t>
+      </w:r>
+    </w:p>
+    <w:p>
+      <w:pPr>
+        <w:pStyle w:val="BodyText"/>
+        <w:spacing w:before="0" w:after="0"/>
+        <w:ind w:left="720"/>
+      </w:pPr>
     </w:p>
     <w:p>
       <w:pPr>
@@ -59,7 +183,10 @@
         <w:pStyle w:val="BodyText"/>
       </w:pPr>
       <w:r>
-        <w:t>The basic idea was to reshape the capture into short observation vectors, build a sample covariance matrix, compute its eigenvalues, and then use the MDL criterion to decide where the signal subspace ends and the noise-only eigenvalues begin. Once that split is chosen, the noise variance estimate is the average of the trailing eigenvalues.</w:t>
+        <w:t xml:space="preserve">The basic idea was to reshape the capture into short observation vectors, build a sample covariance matrix, compute its eigenvalues, and then use the MDL criterion to decide where the signal subspace ends and the noise-only eigenvalues begin. </w:t>
+      </w:r>
+      <w:r>
+        <w:t>Once the MDL criterion selects the signal subspace dimension k, the noise variance estimate is computed as the mean of the remaining N−k smallest eigenvalues.</w:t>
       </w:r>
     </w:p>
     <w:p>
@@ -67,6 +194,7 @@
         <w:pStyle w:val="BodyText"/>
       </w:pPr>
       <w:r>
+        <w:lastRenderedPageBreak/>
         <w:t>The main equations behind that idea are</w:t>
       </w:r>
     </w:p>
@@ -413,7 +541,6 @@
         <w:pStyle w:val="BodyText"/>
       </w:pPr>
       <w:r>
-        <w:lastRenderedPageBreak/>
         <w:t>The MDL estimator reused here is the same implementation developed in Module 11. In this module, the implementation used 10-sample observations so that the estimator lined up cleanly with the 10-sample timeslot structure used later in the detector problems. Problem 2.1 also saved the per-timeslot energies for later reuse, but those energies were not used as the actual noise estimator.</w:t>
       </w:r>
     </w:p>
@@ -744,7 +871,15 @@
         <w:pStyle w:val="FirstParagraph"/>
       </w:pPr>
       <w:r>
-        <w:t>The main assumption that mattered here was that the MDL estimator from Module 11 could be reused directly as long as the observation length matched the Module 12 timeslot structure. Once that was settled, the rest of the module could build on the saved noise estimates and saved timeslot energies without recomputing them.</w:t>
+        <w:t xml:space="preserve">The main assumption that mattered here was that the MDL estimator from Module 11 could be reused directly </w:t>
+      </w:r>
+      <w:proofErr w:type="gramStart"/>
+      <w:r>
+        <w:t>as long as</w:t>
+      </w:r>
+      <w:proofErr w:type="gramEnd"/>
+      <w:r>
+        <w:t xml:space="preserve"> the observation length matched the Module 12 timeslot structure. Once that was settled, the rest of the module could build on the saved noise estimates and saved timeslot energies without recomputing them.</w:t>
       </w:r>
     </w:p>
     <w:p>
@@ -755,6 +890,7 @@
       <w:bookmarkEnd w:id="2"/>
       <w:bookmarkEnd w:id="5"/>
       <w:r>
+        <w:lastRenderedPageBreak/>
         <w:t>3. Problem 2.2 – CFAR Threshold</w:t>
       </w:r>
     </w:p>
@@ -943,7 +1079,21 @@
         </m:r>
       </m:oMath>
       <w:r>
-        <w:t xml:space="preserve">. Under noise-only conditions, the summed complex-sample energy was modeled as gamma distributed with shape </w:t>
+        <w:t xml:space="preserve">. </w:t>
+      </w:r>
+      <w:r>
+        <w:t xml:space="preserve">Under noise-only conditions, the statistic follows a scaled chi-square distribution with </w:t>
+      </w:r>
+      <m:oMath>
+        <m:r>
+          <w:rPr>
+            <w:rFonts w:ascii="Cambria Math" w:hAnsi="Cambria Math"/>
+          </w:rPr>
+          <m:t>2N</m:t>
+        </m:r>
+      </m:oMath>
+      <w:r>
+        <w:t xml:space="preserve">degrees of freedom, which is equivalent to a Gamma distribution with shape </w:t>
       </w:r>
       <m:oMath>
         <m:r>
@@ -954,17 +1104,17 @@
         </m:r>
       </m:oMath>
       <w:r>
-        <w:t xml:space="preserve"> and scale </w:t>
+        <w:t xml:space="preserve">and scale </w:t>
       </w:r>
       <m:oMath>
-        <m:sSubSup>
-          <m:sSubSupPr>
+        <m:sSup>
+          <m:sSupPr>
             <m:ctrlPr>
               <w:rPr>
                 <w:rFonts w:ascii="Cambria Math" w:hAnsi="Cambria Math"/>
               </w:rPr>
             </m:ctrlPr>
-          </m:sSubSupPr>
+          </m:sSupPr>
           <m:e>
             <m:r>
               <w:rPr>
@@ -973,14 +1123,6 @@
               <m:t>σ</m:t>
             </m:r>
           </m:e>
-          <m:sub>
-            <m:r>
-              <w:rPr>
-                <w:rFonts w:ascii="Cambria Math" w:hAnsi="Cambria Math"/>
-              </w:rPr>
-              <m:t>n</m:t>
-            </m:r>
-          </m:sub>
           <m:sup>
             <m:r>
               <w:rPr>
@@ -989,10 +1131,13 @@
               <m:t>2</m:t>
             </m:r>
           </m:sup>
-        </m:sSubSup>
+        </m:sSup>
       </m:oMath>
       <w:r>
-        <w:t xml:space="preserve"> per complex sample. That made the threshold calculation</w:t>
+        <w:t>.</w:t>
+      </w:r>
+      <w:r>
+        <w:t xml:space="preserve"> That made the threshold calculation</w:t>
       </w:r>
     </w:p>
     <w:p>
@@ -1008,7 +1153,6 @@
             <w:rPr>
               <w:rFonts w:ascii="Cambria Math" w:hAnsi="Cambria Math"/>
             </w:rPr>
-            <w:lastRenderedPageBreak/>
             <m:t>P</m:t>
           </m:r>
           <m:r>
@@ -1684,6 +1828,7 @@
               <w:pStyle w:val="Compact"/>
             </w:pPr>
             <w:r>
+              <w:lastRenderedPageBreak/>
               <w:t>5</w:t>
             </w:r>
           </w:p>
@@ -2363,6 +2508,12 @@
       <w:r>
         <w:t>, but the correct interpretation here is total signal energy over the full 10-sample measurement window.</w:t>
       </w:r>
+      <w:r>
+        <w:t xml:space="preserve"> </w:t>
+      </w:r>
+      <w:r>
+        <w:t>This expression comes from the non-central chi-square distribution of the energy detector statistic under the signal-present hypothesis.</w:t>
+      </w:r>
     </w:p>
     <w:p>
       <w:pPr>
@@ -2410,7 +2561,13 @@
         </m:sSub>
       </m:oMath>
       <w:r>
-        <w:t>. That is why noisier channels or more conservative thresholds lead to lower detection probability.</w:t>
+        <w:t xml:space="preserve">. That is why noisier </w:t>
+      </w:r>
+      <w:r>
+        <w:t>channels,</w:t>
+      </w:r>
+      <w:r>
+        <w:t xml:space="preserve"> or more conservative thresholds lead to lower detection probability.</w:t>
       </w:r>
     </w:p>
     <w:p>
@@ -2706,6 +2863,7 @@
               <w:pStyle w:val="Compact"/>
             </w:pPr>
             <w:r>
+              <w:lastRenderedPageBreak/>
               <w:t>4</w:t>
             </w:r>
           </w:p>
@@ -2875,7 +3033,6 @@
       <w:bookmarkStart w:id="12" w:name="plot"/>
       <w:bookmarkEnd w:id="11"/>
       <w:r>
-        <w:lastRenderedPageBreak/>
         <w:t>Plot</w:t>
       </w:r>
     </w:p>
@@ -2954,7 +3111,15 @@
         <w:pStyle w:val="FirstParagraph"/>
       </w:pPr>
       <w:r>
-        <w:t>Problem 2.4 applied the saved thresholds from Problem 2.2 to the saved timeslot energies from Problem 2.1 in order to decide whether each timeslot was occupied or idle.</w:t>
+        <w:t xml:space="preserve">Problem 2.4 applied the saved thresholds from Problem 2.2 to the saved timeslot energies from Problem 2.1 </w:t>
+      </w:r>
+      <w:proofErr w:type="gramStart"/>
+      <w:r>
+        <w:t>in order to</w:t>
+      </w:r>
+      <w:proofErr w:type="gramEnd"/>
+      <w:r>
+        <w:t xml:space="preserve"> decide whether each timeslot was occupied or idle.</w:t>
       </w:r>
     </w:p>
     <w:p>
@@ -3114,6 +3279,7 @@
         <w:pStyle w:val="BodyText"/>
       </w:pPr>
       <w:r>
+        <w:lastRenderedPageBreak/>
         <w:t>This step was important because it produced the first full binary activity sequence for each channel. Those saved decision vectors became the observed sequences used later for the HMM work.</w:t>
       </w:r>
     </w:p>
@@ -3122,11 +3288,15 @@
         <w:pStyle w:val="BodyText"/>
       </w:pPr>
       <w:r>
-        <w:t xml:space="preserve">For the example channel, the truth sequence was available, so I could directly compare the detector output against the actual state sequence. One subtle point here was that the example truth labels were coded as two state labels rather than simple 0/1 values, so the </w:t>
-      </w:r>
-      <w:r>
-        <w:lastRenderedPageBreak/>
-        <w:t>larger label had to be treated as the occupied state before computing agreement and confusion counts.</w:t>
+        <w:t xml:space="preserve">For </w:t>
+      </w:r>
+      <w:proofErr w:type="gramStart"/>
+      <w:r>
+        <w:t>the example channel</w:t>
+      </w:r>
+      <w:proofErr w:type="gramEnd"/>
+      <w:r>
+        <w:t>, the truth sequence was available, so I could directly compare the detector output against the actual state sequence. One subtle point here was that the example truth labels were coded as two state labels rather than simple 0/1 values, so the larger label had to be treated as the occupied state before computing agreement and confusion counts.</w:t>
       </w:r>
     </w:p>
     <w:p>
@@ -3719,6 +3889,7 @@
         <w:pStyle w:val="FirstParagraph"/>
       </w:pPr>
       <w:r>
+        <w:lastRenderedPageBreak/>
         <w:t>The key modeling point here is that the detector outputs from Problem 2.4 are not the hidden states themselves. They are observations generated from those hidden states through an imperfect detector. That is why an emission matrix is needed in addition to the transition matrix.</w:t>
       </w:r>
     </w:p>
@@ -3743,7 +3914,6 @@
             <w:rPr>
               <w:rFonts w:ascii="Cambria Math" w:hAnsi="Cambria Math"/>
             </w:rPr>
-            <w:lastRenderedPageBreak/>
             <m:t>A</m:t>
           </m:r>
           <m:r>
@@ -4520,6 +4690,7 @@
       <w:bookmarkStart w:id="23" w:name="channel-2"/>
       <w:bookmarkEnd w:id="22"/>
       <w:r>
+        <w:lastRenderedPageBreak/>
         <w:t>Channel 2</w:t>
       </w:r>
     </w:p>
@@ -4580,7 +4751,6 @@
       <w:bookmarkStart w:id="25" w:name="channel-4"/>
       <w:bookmarkEnd w:id="24"/>
       <w:r>
-        <w:lastRenderedPageBreak/>
         <w:t>Channel 4</w:t>
       </w:r>
     </w:p>
@@ -4901,15 +5071,6 @@
                 </m:mPr>
                 <m:mr>
                   <m:e>
-                    <m:r>
-                      <m:rPr>
-                        <m:sty m:val="p"/>
-                      </m:rPr>
-                      <w:rPr>
-                        <w:rFonts w:ascii="Cambria Math" w:hAnsi="Cambria Math"/>
-                      </w:rPr>
-                      <m:t>[</m:t>
-                    </m:r>
                     <m:r>
                       <w:rPr>
                         <w:rFonts w:ascii="Cambria Math" w:hAnsi="Cambria Math"/>
@@ -4972,15 +5133,6 @@
                       </w:rPr>
                       <m:t>b</m:t>
                     </m:r>
-                    <m:r>
-                      <m:rPr>
-                        <m:sty m:val="p"/>
-                      </m:rPr>
-                      <w:rPr>
-                        <w:rFonts w:ascii="Cambria Math" w:hAnsi="Cambria Math"/>
-                      </w:rPr>
-                      <m:t>]</m:t>
-                    </m:r>
                   </m:e>
                 </m:mr>
               </m:m>
@@ -4993,8 +5145,13 @@
       <w:pPr>
         <w:pStyle w:val="FirstParagraph"/>
       </w:pPr>
-      <w:r>
-        <w:t>the steady-state shortcut is</w:t>
+      <w:proofErr w:type="gramStart"/>
+      <w:r>
+        <w:t>the</w:t>
+      </w:r>
+      <w:proofErr w:type="gramEnd"/>
+      <w:r>
+        <w:t xml:space="preserve"> steady-state shortcut is</w:t>
       </w:r>
     </w:p>
     <w:p>
@@ -5185,6 +5342,7 @@
         <w:pStyle w:val="BodyText"/>
       </w:pPr>
       <w:r>
+        <w:lastRenderedPageBreak/>
         <w:t>The resulting steady-state probabilities are predictions of the long-term fraction of time the channel should spend idle and occupied. These can differ from the observed percentages from Problem 2.4 because:</w:t>
       </w:r>
     </w:p>
@@ -5208,8 +5366,13 @@
           <w:numId w:val="8"/>
         </w:numPr>
       </w:pPr>
-      <w:r>
-        <w:t>the detector makes false alarms and missed detections</w:t>
+      <w:proofErr w:type="gramStart"/>
+      <w:r>
+        <w:t>the</w:t>
+      </w:r>
+      <w:proofErr w:type="gramEnd"/>
+      <w:r>
+        <w:t xml:space="preserve"> detector makes false alarms and missed detections</w:t>
       </w:r>
     </w:p>
     <w:p>
@@ -5232,9 +5395,13 @@
           <w:numId w:val="8"/>
         </w:numPr>
       </w:pPr>
-      <w:r>
-        <w:lastRenderedPageBreak/>
-        <w:t>the limiting distribution is a steady-state quantity, while the measured sequence may contain transient effects</w:t>
+      <w:proofErr w:type="gramStart"/>
+      <w:r>
+        <w:t>the</w:t>
+      </w:r>
+      <w:proofErr w:type="gramEnd"/>
+      <w:r>
+        <w:t xml:space="preserve"> limiting distribution is a steady-state quantity, while the measured sequence may contain transient effects</w:t>
       </w:r>
     </w:p>
     <w:p>
@@ -5251,7 +5418,15 @@
         <w:pStyle w:val="FirstParagraph"/>
       </w:pPr>
       <w:r>
-        <w:t>The predicted steady-state percentages are very close to the truth-derived percentages, which is a good sign that the HMM model is capturing the channel behavior fairly well.</w:t>
+        <w:t xml:space="preserve">The predicted steady-state percentages are very close to the truth-derived percentages, which is a good sign that the HMM model is capturing the channel behavior </w:t>
+      </w:r>
+      <w:proofErr w:type="gramStart"/>
+      <w:r>
+        <w:t>fairly well</w:t>
+      </w:r>
+      <w:proofErr w:type="gramEnd"/>
+      <w:r>
+        <w:t>.</w:t>
       </w:r>
     </w:p>
     <w:tbl>
@@ -6054,7 +6229,16 @@
         <w:pStyle w:val="FirstParagraph"/>
       </w:pPr>
       <w:r>
-        <w:t>The important event definition was that the count uses overlapping sliding windows. So if 5 slots in a row are idle, that contributes 2 successful length-4 windows instead of just 1 disjoint run.</w:t>
+        <w:lastRenderedPageBreak/>
+        <w:t xml:space="preserve">The important event definition was that the count uses overlapping sliding windows. </w:t>
+      </w:r>
+      <w:proofErr w:type="gramStart"/>
+      <w:r>
+        <w:t>So</w:t>
+      </w:r>
+      <w:proofErr w:type="gramEnd"/>
+      <w:r>
+        <w:t xml:space="preserve"> if 5 slots in a row are idle, that contributes 2 successful length-4 windows instead of just 1 disjoint run.</w:t>
       </w:r>
     </w:p>
     <w:p>
@@ -6177,7 +6361,6 @@
         <w:pStyle w:val="FirstParagraph"/>
       </w:pPr>
       <w:r>
-        <w:lastRenderedPageBreak/>
         <w:t xml:space="preserve">For the Markov-model method, this is not an IID problem, so the correct shortcut is not </w:t>
       </w:r>
       <m:oMath>
@@ -6707,6 +6890,7 @@
         <w:rPr>
           <w:noProof/>
         </w:rPr>
+        <w:lastRenderedPageBreak/>
         <w:drawing>
           <wp:inline distT="0" distB="0" distL="0" distR="0" wp14:anchorId="7523FCB4" wp14:editId="00A28B97">
             <wp:extent cx="5334000" cy="3490743"/>
@@ -6766,7 +6950,6 @@
         <w:rPr>
           <w:noProof/>
         </w:rPr>
-        <w:lastRenderedPageBreak/>
         <w:drawing>
           <wp:inline distT="0" distB="0" distL="0" distR="0" wp14:anchorId="76D1DF9E" wp14:editId="6C7CA057">
             <wp:extent cx="5334000" cy="3490743"/>
@@ -6825,6 +7008,7 @@
       <w:bookmarkStart w:id="36" w:name="all-channels"/>
       <w:bookmarkEnd w:id="35"/>
       <w:r>
+        <w:lastRenderedPageBreak/>
         <w:t>All Channels</w:t>
       </w:r>
     </w:p>
@@ -7278,7 +7462,6 @@
       <w:bookmarkEnd w:id="33"/>
       <w:bookmarkEnd w:id="37"/>
       <w:r>
-        <w:lastRenderedPageBreak/>
         <w:t>9. Problem 2.8 – Modulation Classifier Accuracy vs SNR</w:t>
       </w:r>
     </w:p>
@@ -7669,6 +7852,7 @@
               <w:pStyle w:val="Compact"/>
             </w:pPr>
             <w:r>
+              <w:lastRenderedPageBreak/>
               <w:t>8.0</w:t>
             </w:r>
           </w:p>
@@ -8141,7 +8325,6 @@
         <w:rPr>
           <w:noProof/>
         </w:rPr>
-        <w:lastRenderedPageBreak/>
         <w:drawing>
           <wp:inline distT="0" distB="0" distL="0" distR="0" wp14:anchorId="04201D39" wp14:editId="5F0DD1AC">
             <wp:extent cx="5334000" cy="3523906"/>
@@ -8200,6 +8383,7 @@
       <w:bookmarkStart w:id="40" w:name="constellation-density-plots"/>
       <w:bookmarkEnd w:id="39"/>
       <w:r>
+        <w:lastRenderedPageBreak/>
         <w:t>Constellation Density Plots</w:t>
       </w:r>
     </w:p>
@@ -8270,7 +8454,6 @@
         <w:rPr>
           <w:noProof/>
         </w:rPr>
-        <w:lastRenderedPageBreak/>
         <w:drawing>
           <wp:inline distT="0" distB="0" distL="0" distR="0" wp14:anchorId="2287B3E8" wp14:editId="4B0D9CBA">
             <wp:extent cx="5334000" cy="3326661"/>
@@ -8330,6 +8513,7 @@
         <w:rPr>
           <w:noProof/>
         </w:rPr>
+        <w:lastRenderedPageBreak/>
         <w:drawing>
           <wp:inline distT="0" distB="0" distL="0" distR="0" wp14:anchorId="6442766B" wp14:editId="64C5C175">
             <wp:extent cx="5334000" cy="3269585"/>
@@ -8389,7 +8573,6 @@
         <w:rPr>
           <w:noProof/>
         </w:rPr>
-        <w:lastRenderedPageBreak/>
         <w:drawing>
           <wp:inline distT="0" distB="0" distL="0" distR="0" wp14:anchorId="119B9680" wp14:editId="18E95CAE">
             <wp:extent cx="5334000" cy="3322881"/>
@@ -8456,7 +8639,11 @@
         <w:pStyle w:val="FirstParagraph"/>
       </w:pPr>
       <w:r>
-        <w:t>The accuracy drops as SNR decreases because noise spreads out the I/Q clusters and makes the BPSK structure harder for the CNN to recognize. At high SNR the classifier is almost perfect, but once the noise starts overlapping the constellation clusters more heavily, the classifier performance falls quickly.</w:t>
+        <w:t xml:space="preserve">The accuracy drops as SNR decreases because noise spreads out the I/Q clusters and makes the BPSK structure harder for the CNN to recognize. At high SNR the classifier is </w:t>
+      </w:r>
+      <w:r>
+        <w:lastRenderedPageBreak/>
+        <w:t>almost perfect, but once the noise starts overlapping the constellation clusters more heavily, the classifier performance falls quickly.</w:t>
       </w:r>
     </w:p>
     <w:p>
@@ -8553,7 +8740,6 @@
       <w:bookmarkEnd w:id="38"/>
       <w:bookmarkEnd w:id="42"/>
       <w:r>
-        <w:lastRenderedPageBreak/>
         <w:t>10. Conclusion</w:t>
       </w:r>
     </w:p>
@@ -8644,8 +8830,16 @@
         <w:rPr>
           <w:rStyle w:val="VerbatimChar"/>
         </w:rPr>
-        <w:t>Lab12_files/experiment_hmm_limiting_distribution.m</w:t>
-      </w:r>
+        <w:t>Lab12_files/</w:t>
+      </w:r>
+      <w:proofErr w:type="spellStart"/>
+      <w:r>
+        <w:rPr>
+          <w:rStyle w:val="VerbatimChar"/>
+        </w:rPr>
+        <w:t>experiment_hmm_limiting_distribution.m</w:t>
+      </w:r>
+      <w:proofErr w:type="spellEnd"/>
     </w:p>
     <w:p>
       <w:pPr>
@@ -8659,8 +8853,16 @@
         <w:rPr>
           <w:rStyle w:val="VerbatimChar"/>
         </w:rPr>
-        <w:t>Lab12_files/experiment_training_a_hmm_model.m</w:t>
-      </w:r>
+        <w:t>Lab12_files/</w:t>
+      </w:r>
+      <w:proofErr w:type="spellStart"/>
+      <w:r>
+        <w:rPr>
+          <w:rStyle w:val="VerbatimChar"/>
+        </w:rPr>
+        <w:t>experiment_training_a_hmm_model.m</w:t>
+      </w:r>
+      <w:proofErr w:type="spellEnd"/>
     </w:p>
     <w:p>
       <w:pPr>
@@ -8674,8 +8876,16 @@
         <w:rPr>
           <w:rStyle w:val="VerbatimChar"/>
         </w:rPr>
-        <w:t>Lab12_files/modulation_classification_in_noise.m</w:t>
-      </w:r>
+        <w:t>Lab12_files/</w:t>
+      </w:r>
+      <w:proofErr w:type="spellStart"/>
+      <w:r>
+        <w:rPr>
+          <w:rStyle w:val="VerbatimChar"/>
+        </w:rPr>
+        <w:t>modulation_classification_in_noise.m</w:t>
+      </w:r>
+      <w:proofErr w:type="spellEnd"/>
     </w:p>
     <w:p>
       <w:pPr>
@@ -8886,6 +9096,119 @@
       </w:pPr>
       <w:rPr>
         <w:rFonts w:ascii="Wingdings" w:hAnsi="Wingdings" w:cs="Wingdings" w:hint="default"/>
+      </w:rPr>
+    </w:lvl>
+  </w:abstractNum>
+  <w:abstractNum w:abstractNumId="2" w15:restartNumberingAfterBreak="0">
+    <w:nsid w:val="16185A6F"/>
+    <w:multiLevelType w:val="hybridMultilevel"/>
+    <w:tmpl w:val="39CE263E"/>
+    <w:lvl w:ilvl="0" w:tplc="04090001">
+      <w:start w:val="1"/>
+      <w:numFmt w:val="bullet"/>
+      <w:lvlText w:val=""/>
+      <w:lvlJc w:val="left"/>
+      <w:pPr>
+        <w:ind w:left="720" w:hanging="360"/>
+      </w:pPr>
+      <w:rPr>
+        <w:rFonts w:ascii="Symbol" w:hAnsi="Symbol" w:hint="default"/>
+      </w:rPr>
+    </w:lvl>
+    <w:lvl w:ilvl="1" w:tplc="04090003" w:tentative="1">
+      <w:start w:val="1"/>
+      <w:numFmt w:val="bullet"/>
+      <w:lvlText w:val="o"/>
+      <w:lvlJc w:val="left"/>
+      <w:pPr>
+        <w:ind w:left="1440" w:hanging="360"/>
+      </w:pPr>
+      <w:rPr>
+        <w:rFonts w:ascii="Courier New" w:hAnsi="Courier New" w:cs="Courier New" w:hint="default"/>
+      </w:rPr>
+    </w:lvl>
+    <w:lvl w:ilvl="2" w:tplc="04090005" w:tentative="1">
+      <w:start w:val="1"/>
+      <w:numFmt w:val="bullet"/>
+      <w:lvlText w:val=""/>
+      <w:lvlJc w:val="left"/>
+      <w:pPr>
+        <w:ind w:left="2160" w:hanging="360"/>
+      </w:pPr>
+      <w:rPr>
+        <w:rFonts w:ascii="Wingdings" w:hAnsi="Wingdings" w:hint="default"/>
+      </w:rPr>
+    </w:lvl>
+    <w:lvl w:ilvl="3" w:tplc="04090001" w:tentative="1">
+      <w:start w:val="1"/>
+      <w:numFmt w:val="bullet"/>
+      <w:lvlText w:val=""/>
+      <w:lvlJc w:val="left"/>
+      <w:pPr>
+        <w:ind w:left="2880" w:hanging="360"/>
+      </w:pPr>
+      <w:rPr>
+        <w:rFonts w:ascii="Symbol" w:hAnsi="Symbol" w:hint="default"/>
+      </w:rPr>
+    </w:lvl>
+    <w:lvl w:ilvl="4" w:tplc="04090003" w:tentative="1">
+      <w:start w:val="1"/>
+      <w:numFmt w:val="bullet"/>
+      <w:lvlText w:val="o"/>
+      <w:lvlJc w:val="left"/>
+      <w:pPr>
+        <w:ind w:left="3600" w:hanging="360"/>
+      </w:pPr>
+      <w:rPr>
+        <w:rFonts w:ascii="Courier New" w:hAnsi="Courier New" w:cs="Courier New" w:hint="default"/>
+      </w:rPr>
+    </w:lvl>
+    <w:lvl w:ilvl="5" w:tplc="04090005" w:tentative="1">
+      <w:start w:val="1"/>
+      <w:numFmt w:val="bullet"/>
+      <w:lvlText w:val=""/>
+      <w:lvlJc w:val="left"/>
+      <w:pPr>
+        <w:ind w:left="4320" w:hanging="360"/>
+      </w:pPr>
+      <w:rPr>
+        <w:rFonts w:ascii="Wingdings" w:hAnsi="Wingdings" w:hint="default"/>
+      </w:rPr>
+    </w:lvl>
+    <w:lvl w:ilvl="6" w:tplc="04090001" w:tentative="1">
+      <w:start w:val="1"/>
+      <w:numFmt w:val="bullet"/>
+      <w:lvlText w:val=""/>
+      <w:lvlJc w:val="left"/>
+      <w:pPr>
+        <w:ind w:left="5040" w:hanging="360"/>
+      </w:pPr>
+      <w:rPr>
+        <w:rFonts w:ascii="Symbol" w:hAnsi="Symbol" w:hint="default"/>
+      </w:rPr>
+    </w:lvl>
+    <w:lvl w:ilvl="7" w:tplc="04090003" w:tentative="1">
+      <w:start w:val="1"/>
+      <w:numFmt w:val="bullet"/>
+      <w:lvlText w:val="o"/>
+      <w:lvlJc w:val="left"/>
+      <w:pPr>
+        <w:ind w:left="5760" w:hanging="360"/>
+      </w:pPr>
+      <w:rPr>
+        <w:rFonts w:ascii="Courier New" w:hAnsi="Courier New" w:cs="Courier New" w:hint="default"/>
+      </w:rPr>
+    </w:lvl>
+    <w:lvl w:ilvl="8" w:tplc="04090005" w:tentative="1">
+      <w:start w:val="1"/>
+      <w:numFmt w:val="bullet"/>
+      <w:lvlText w:val=""/>
+      <w:lvlJc w:val="left"/>
+      <w:pPr>
+        <w:ind w:left="6480" w:hanging="360"/>
+      </w:pPr>
+      <w:rPr>
+        <w:rFonts w:ascii="Wingdings" w:hAnsi="Wingdings" w:hint="default"/>
       </w:rPr>
     </w:lvl>
   </w:abstractNum>
@@ -8927,6 +9250,9 @@
   </w:num>
   <w:num w:numId="13" w16cid:durableId="227738270">
     <w:abstractNumId w:val="1"/>
+  </w:num>
+  <w:num w:numId="14" w16cid:durableId="1586265383">
+    <w:abstractNumId w:val="2"/>
   </w:num>
 </w:numbering>
 </file>
@@ -9398,7 +9724,6 @@
   <w:style w:type="character" w:default="1" w:styleId="DefaultParagraphFont">
     <w:name w:val="Default Paragraph Font"/>
     <w:uiPriority w:val="1"/>
-    <w:semiHidden/>
     <w:unhideWhenUsed/>
   </w:style>
   <w:style w:type="table" w:default="1" w:styleId="TableNormal">

</xml_diff>